<commit_message>
Update SAGA v0.6 docx with Eco/Crítico split and corrections
- Add Eco/Crítico separation: Eco gives +1 Karma (out of combat) or
  +1 Naipe (in combat); Crítico (6+6) is always Pleno + Eco + 3 Dano
- Fix Defense: optional (not automatic), doesn't cost action
- Clarify Combinação: +1 Naipe applies on both Parcial and Pleno
- Update damage labels from "Crítico (Eco)" to "Crítico (6+6)"
- Update revision guide table for Eco/Crítico changes

Co-Authored-By: Claude Opus 4.6 <noreply@anthropic.com>
Claude-Session: https://claude.ai/code/session_01RVU8t57j5oRMTt1gU1F1Um
</commit_message>
<xml_diff>
--- a/SAGA_v06_Patch_Notes.docx
+++ b/SAGA_v06_Patch_Notes.docx
@@ -623,6 +623,216 @@
     </w:p>
     <w:p>
       <w:pPr>
+        <w:pStyle w:val="Heading2"/>
+        <w:spacing w:after="80" w:before="280"/>
+      </w:pPr>
+      <w:r>
+        <w:rPr>
+          <w:rFonts w:ascii="Calibri" w:cs="Calibri" w:eastAsia="Calibri" w:hAnsi="Calibri"/>
+          <w:b/>
+          <w:bCs/>
+          <w:color w:val="374151"/>
+          <w:sz w:val="26"/>
+          <w:szCs w:val="26"/>
+        </w:rPr>
+        <w:t xml:space="preserve">Eco — Revisão</w:t>
+      </w:r>
+    </w:p>
+    <w:p>
+      <w:pPr>
+        <w:spacing w:after="120"/>
+      </w:pPr>
+      <w:r>
+        <w:rPr>
+          <w:rFonts w:ascii="Calibri" w:cs="Calibri" w:eastAsia="Calibri" w:hAnsi="Calibri"/>
+          <w:sz w:val="22"/>
+          <w:szCs w:val="22"/>
+        </w:rPr>
+        <w:t xml:space="preserve">Eco (dados iguais) agora funciona diferente dentro e fora de combate:</w:t>
+      </w:r>
+    </w:p>
+    <w:p>
+      <w:pPr>
+        <w:pStyle w:val="ListParagraph"/>
+        <w:numPr>
+          <w:ilvl w:val="0"/>
+          <w:numId w:val="2"/>
+        </w:numPr>
+        <w:spacing w:after="60"/>
+      </w:pPr>
+      <w:r>
+        <w:rPr>
+          <w:rFonts w:ascii="Calibri" w:cs="Calibri" w:eastAsia="Calibri" w:hAnsi="Calibri"/>
+          <w:b/>
+          <w:bCs/>
+          <w:sz w:val="22"/>
+          <w:szCs w:val="22"/>
+        </w:rPr>
+        <w:t xml:space="preserve">Fora de combate:</w:t>
+      </w:r>
+      <w:r>
+        <w:rPr>
+          <w:rFonts w:ascii="Calibri" w:cs="Calibri" w:eastAsia="Calibri" w:hAnsi="Calibri"/>
+          <w:sz w:val="22"/>
+          <w:szCs w:val="22"/>
+        </w:rPr>
+        <w:t xml:space="preserve"> Eco gera +1 Karma, independente do resultado da rolagem.</w:t>
+      </w:r>
+    </w:p>
+    <w:p>
+      <w:pPr>
+        <w:pStyle w:val="ListParagraph"/>
+        <w:numPr>
+          <w:ilvl w:val="0"/>
+          <w:numId w:val="2"/>
+        </w:numPr>
+        <w:spacing w:after="60"/>
+      </w:pPr>
+      <w:r>
+        <w:rPr>
+          <w:rFonts w:ascii="Calibri" w:cs="Calibri" w:eastAsia="Calibri" w:hAnsi="Calibri"/>
+          <w:b/>
+          <w:bCs/>
+          <w:sz w:val="22"/>
+          <w:szCs w:val="22"/>
+        </w:rPr>
+        <w:t xml:space="preserve">Em combate:</w:t>
+      </w:r>
+      <w:r>
+        <w:rPr>
+          <w:rFonts w:ascii="Calibri" w:cs="Calibri" w:eastAsia="Calibri" w:hAnsi="Calibri"/>
+          <w:sz w:val="22"/>
+          <w:szCs w:val="22"/>
+        </w:rPr>
+        <w:t xml:space="preserve"> Eco gera +1 Naipe extra — escolha qualquer da lista. Funciona em qualquer resultado (Falha, Parcial ou Pleno).</w:t>
+      </w:r>
+    </w:p>
+    <w:p>
+      <w:pPr>
+        <w:spacing w:after="120"/>
+      </w:pPr>
+      <w:r>
+        <w:rPr>
+          <w:rFonts w:ascii="Calibri" w:cs="Calibri" w:eastAsia="Calibri" w:hAnsi="Calibri"/>
+          <w:b/>
+          <w:bCs/>
+          <w:sz w:val="22"/>
+          <w:szCs w:val="22"/>
+        </w:rPr>
+        <w:t xml:space="preserve">Impacto:</w:t>
+      </w:r>
+      <w:r>
+        <w:rPr>
+          <w:rFonts w:ascii="Calibri" w:cs="Calibri" w:eastAsia="Calibri" w:hAnsi="Calibri"/>
+          <w:sz w:val="22"/>
+          <w:szCs w:val="22"/>
+        </w:rPr>
+        <w:t xml:space="preserve"> Eco em Falha de combate: você falha, mas ganha 1 Naipe. Eco em Parcial: resultado normal (+1 Karma) e +1 Naipe do Eco. Eco em Pleno: resultado normal (2 Dano + 1 Naipe) e +1 Naipe extra do Eco.</w:t>
+      </w:r>
+    </w:p>
+    <w:p>
+      <w:pPr>
+        <w:pStyle w:val="Heading2"/>
+        <w:spacing w:after="80" w:before="280"/>
+      </w:pPr>
+      <w:r>
+        <w:rPr>
+          <w:rFonts w:ascii="Calibri" w:cs="Calibri" w:eastAsia="Calibri" w:hAnsi="Calibri"/>
+          <w:b/>
+          <w:bCs/>
+          <w:color w:val="374151"/>
+          <w:sz w:val="26"/>
+          <w:szCs w:val="26"/>
+        </w:rPr>
+        <w:t xml:space="preserve">Crítico (6+6) — Separado do Eco</w:t>
+      </w:r>
+    </w:p>
+    <w:p>
+      <w:pPr>
+        <w:spacing w:after="120"/>
+      </w:pPr>
+      <w:r>
+        <w:rPr>
+          <w:rFonts w:ascii="Calibri" w:cs="Calibri" w:eastAsia="Calibri" w:hAnsi="Calibri"/>
+          <w:sz w:val="22"/>
+          <w:szCs w:val="22"/>
+        </w:rPr>
+        <w:t xml:space="preserve">Tirar 6+6 é sempre Sucesso Pleno e conta como Eco.</w:t>
+      </w:r>
+    </w:p>
+    <w:p>
+      <w:pPr>
+        <w:pStyle w:val="ListParagraph"/>
+        <w:numPr>
+          <w:ilvl w:val="0"/>
+          <w:numId w:val="2"/>
+        </w:numPr>
+        <w:spacing w:after="60"/>
+      </w:pPr>
+      <w:r>
+        <w:rPr>
+          <w:rFonts w:ascii="Calibri" w:cs="Calibri" w:eastAsia="Calibri" w:hAnsi="Calibri"/>
+          <w:b/>
+          <w:bCs/>
+          <w:sz w:val="22"/>
+          <w:szCs w:val="22"/>
+        </w:rPr>
+        <w:t xml:space="preserve">Em combate:</w:t>
+      </w:r>
+      <w:r>
+        <w:rPr>
+          <w:rFonts w:ascii="Calibri" w:cs="Calibri" w:eastAsia="Calibri" w:hAnsi="Calibri"/>
+          <w:sz w:val="22"/>
+          <w:szCs w:val="22"/>
+        </w:rPr>
+        <w:t xml:space="preserve"> aplica o resultado normal do Pleno e soma +1 Naipe do Crítico, +1 Naipe do Eco, e 3 de Dano.</w:t>
+      </w:r>
+    </w:p>
+    <w:p>
+      <w:pPr>
+        <w:pStyle w:val="ListParagraph"/>
+        <w:numPr>
+          <w:ilvl w:val="0"/>
+          <w:numId w:val="2"/>
+        </w:numPr>
+        <w:spacing w:after="60"/>
+      </w:pPr>
+      <w:r>
+        <w:rPr>
+          <w:rFonts w:ascii="Calibri" w:cs="Calibri" w:eastAsia="Calibri" w:hAnsi="Calibri"/>
+          <w:b/>
+          <w:bCs/>
+          <w:sz w:val="22"/>
+          <w:szCs w:val="22"/>
+        </w:rPr>
+        <w:t xml:space="preserve">Fora de combate:</w:t>
+      </w:r>
+      <w:r>
+        <w:rPr>
+          <w:rFonts w:ascii="Calibri" w:cs="Calibri" w:eastAsia="Calibri" w:hAnsi="Calibri"/>
+          <w:sz w:val="22"/>
+          <w:szCs w:val="22"/>
+        </w:rPr>
+        <w:t xml:space="preserve"> o jogador narra o resultado imediato da cena. Gera +1 Karma do Eco.</w:t>
+      </w:r>
+    </w:p>
+    <w:p>
+      <w:pPr>
+        <w:spacing w:after="120"/>
+      </w:pPr>
+      <w:r>
+        <w:rPr>
+          <w:rFonts w:ascii="Calibri" w:cs="Calibri" w:eastAsia="Calibri" w:hAnsi="Calibri"/>
+          <w:i/>
+          <w:iCs/>
+          <w:sz w:val="22"/>
+          <w:szCs w:val="22"/>
+        </w:rPr>
+        <w:t xml:space="preserve">Na v0.5, Eco e Crítico eram a mesma mecânica. Na v0.6, Eco é o efeito genérico de dados iguais, e Crítico (6+6) é o resultado especial que inclui Eco.</w:t>
+      </w:r>
+    </w:p>
+    <w:p>
+      <w:pPr>
         <w:pStyle w:val="Heading1"/>
         <w:spacing w:after="120" w:before="360"/>
       </w:pPr>
@@ -1736,7 +1946,7 @@
                 <w:sz w:val="20"/>
                 <w:szCs w:val="20"/>
               </w:rPr>
-              <w:t xml:space="preserve">Efeito mais forte, +1 dano, +1 Naipe</w:t>
+              <w:t xml:space="preserve">Efeito mais forte, +1 dano, +1 Naipe (Parcial e Pleno)</w:t>
             </w:r>
           </w:p>
         </w:tc>
@@ -1860,7 +2070,7 @@
           <w:sz w:val="22"/>
           <w:szCs w:val="22"/>
         </w:rPr>
-        <w:t xml:space="preserve">+1 dano e +1 Naipe</w:t>
+        <w:t xml:space="preserve">+1 dano e +1 Naipe (em Parcial e Pleno)</w:t>
       </w:r>
       <w:r>
         <w:rPr>
@@ -1956,7 +2166,7 @@
           <w:sz w:val="22"/>
           <w:szCs w:val="22"/>
         </w:rPr>
-        <w:t xml:space="preserve">A Defesa Ativa foi completamente redesenhada. Na v0.5, era uma ação que custava o slot de ataque. Na v0.6, é automática e sem custo.</w:t>
+        <w:t xml:space="preserve">A Defesa Ativa foi completamente redesenhada. Na v0.5, era uma ação que custava o slot de ataque. Na v0.6, é opcional e sem custo de ação.</w:t>
       </w:r>
     </w:p>
     <w:p>
@@ -2110,7 +2320,7 @@
                 <w:sz w:val="20"/>
                 <w:szCs w:val="20"/>
               </w:rPr>
-              <w:t xml:space="preserve">Sem custo, automática</w:t>
+              <w:t xml:space="preserve">Sem custo, opcional</w:t>
             </w:r>
           </w:p>
         </w:tc>
@@ -2334,7 +2544,7 @@
                 <w:sz w:val="20"/>
                 <w:szCs w:val="20"/>
               </w:rPr>
-              <w:t xml:space="preserve">Não — resultado direto da rolagem</w:t>
+              <w:t xml:space="preserve">Sim (defender é opcional), sem custo de ação</w:t>
             </w:r>
           </w:p>
         </w:tc>
@@ -2374,15 +2584,15 @@
           <w:sz w:val="22"/>
           <w:szCs w:val="22"/>
         </w:rPr>
-        <w:t xml:space="preserve">Defesa é automática</w:t>
-      </w:r>
-      <w:r>
-        <w:rPr>
-          <w:rFonts w:ascii="Calibri" w:cs="Calibri" w:eastAsia="Calibri" w:hAnsi="Calibri"/>
-          <w:sz w:val="22"/>
-          <w:szCs w:val="22"/>
-        </w:rPr>
-        <w:t xml:space="preserve"> — não custa ação. O jogador sempre ataca no seu turno; a defesa acontece quando é atacado.</w:t>
+        <w:t xml:space="preserve">Defesa é opcional</w:t>
+      </w:r>
+      <w:r>
+        <w:rPr>
+          <w:rFonts w:ascii="Calibri" w:cs="Calibri" w:eastAsia="Calibri" w:hAnsi="Calibri"/>
+          <w:sz w:val="22"/>
+          <w:szCs w:val="22"/>
+        </w:rPr>
+        <w:t xml:space="preserve"> — o jogador escolhe se quer rolar quando atacado. Não custa ação: defender não corta o ataque no turno.</w:t>
       </w:r>
     </w:p>
     <w:p>
@@ -2501,15 +2711,15 @@
           <w:sz w:val="22"/>
           <w:szCs w:val="22"/>
         </w:rPr>
-        <w:t xml:space="preserve">Sem escolha</w:t>
-      </w:r>
-      <w:r>
-        <w:rPr>
-          <w:rFonts w:ascii="Calibri" w:cs="Calibri" w:eastAsia="Calibri" w:hAnsi="Calibri"/>
-          <w:sz w:val="22"/>
-          <w:szCs w:val="22"/>
-        </w:rPr>
-        <w:t xml:space="preserve"> — o resultado da rolagem define tudo. Isso acelera o combate.</w:t>
+        <w:t xml:space="preserve">Resultado define tudo</w:t>
+      </w:r>
+      <w:r>
+        <w:rPr>
+          <w:rFonts w:ascii="Calibri" w:cs="Calibri" w:eastAsia="Calibri" w:hAnsi="Calibri"/>
+          <w:sz w:val="22"/>
+          <w:szCs w:val="22"/>
+        </w:rPr>
+        <w:t xml:space="preserve"> — uma vez que o jogador rola, o resultado determina o que acontece. Isso acelera o combate.</w:t>
       </w:r>
     </w:p>
     <w:p>
@@ -3861,7 +4071,7 @@
           <w:sz w:val="22"/>
           <w:szCs w:val="22"/>
         </w:rPr>
-        <w:t xml:space="preserve">Crítico (Eco):</w:t>
+        <w:t xml:space="preserve">Crítico (6+6):</w:t>
       </w:r>
       <w:r>
         <w:rPr>
@@ -3975,7 +4185,7 @@
           <w:sz w:val="22"/>
           <w:szCs w:val="22"/>
         </w:rPr>
-        <w:t xml:space="preserve">Crítico (Eco):</w:t>
+        <w:t xml:space="preserve">Crítico (6+6):</w:t>
       </w:r>
       <w:r>
         <w:rPr>
@@ -5297,7 +5507,7 @@
                 <w:sz w:val="20"/>
                 <w:szCs w:val="20"/>
               </w:rPr>
-              <w:t xml:space="preserve">Eco</w:t>
+              <w:t xml:space="preserve">Eco / Crítico</w:t>
             </w:r>
           </w:p>
         </w:tc>
@@ -5315,7 +5525,7 @@
                 <w:sz w:val="20"/>
                 <w:szCs w:val="20"/>
               </w:rPr>
-              <w:t xml:space="preserve">OK</w:t>
+              <w:t xml:space="preserve">MUDOU</w:t>
             </w:r>
           </w:p>
         </w:tc>
@@ -5333,7 +5543,7 @@
                 <w:sz w:val="20"/>
                 <w:szCs w:val="20"/>
               </w:rPr>
-              <w:t xml:space="preserve">—</w:t>
+              <w:t xml:space="preserve">Alta</w:t>
             </w:r>
           </w:p>
         </w:tc>
@@ -5351,7 +5561,7 @@
                 <w:sz w:val="20"/>
                 <w:szCs w:val="20"/>
               </w:rPr>
-              <w:t xml:space="preserve">Manter. Eco = dados iguais = Crítico.</w:t>
+              <w:t xml:space="preserve">Eco separado do Crítico. Eco: +1 Karma (fora) / +1 Naipe (combate). Crítico (6+6): Pleno + Eco + 3 Dano.</w:t>
             </w:r>
           </w:p>
         </w:tc>
@@ -7452,10 +7662,38 @@
       <w:r>
         <w:rPr>
           <w:rFonts w:ascii="Calibri" w:cs="Calibri" w:eastAsia="Calibri" w:hAnsi="Calibri"/>
-          <w:sz w:val="22"/>
-          <w:szCs w:val="22"/>
-        </w:rPr>
-        <w:t xml:space="preserve">Reduz 1 dano por gasto (era 2)</w:t>
+          <w:b/>
+          <w:bCs/>
+          <w:sz w:val="22"/>
+          <w:szCs w:val="22"/>
+        </w:rPr>
+        <w:t xml:space="preserve">Eco fora de combate:</w:t>
+      </w:r>
+      <w:r>
+        <w:rPr>
+          <w:rFonts w:ascii="Calibri" w:cs="Calibri" w:eastAsia="Calibri" w:hAnsi="Calibri"/>
+          <w:sz w:val="22"/>
+          <w:szCs w:val="22"/>
+        </w:rPr>
+        <w:t xml:space="preserve"> +1 Karma; </w:t>
+      </w:r>
+      <w:r>
+        <w:rPr>
+          <w:rFonts w:ascii="Calibri" w:cs="Calibri" w:eastAsia="Calibri" w:hAnsi="Calibri"/>
+          <w:b/>
+          <w:bCs/>
+          <w:sz w:val="22"/>
+          <w:szCs w:val="22"/>
+        </w:rPr>
+        <w:t xml:space="preserve">em combate:</w:t>
+      </w:r>
+      <w:r>
+        <w:rPr>
+          <w:rFonts w:ascii="Calibri" w:cs="Calibri" w:eastAsia="Calibri" w:hAnsi="Calibri"/>
+          <w:sz w:val="22"/>
+          <w:szCs w:val="22"/>
+        </w:rPr>
+        <w:t xml:space="preserve"> +1 Naipe extra</w:t>
       </w:r>
     </w:p>
     <w:p>
@@ -7475,15 +7713,15 @@
           <w:sz w:val="22"/>
           <w:szCs w:val="22"/>
         </w:rPr>
-        <w:t xml:space="preserve">Forçar (NOVO):</w:t>
-      </w:r>
-      <w:r>
-        <w:rPr>
-          <w:rFonts w:ascii="Calibri" w:cs="Calibri" w:eastAsia="Calibri" w:hAnsi="Calibri"/>
-          <w:sz w:val="22"/>
-          <w:szCs w:val="22"/>
-        </w:rPr>
-        <w:t xml:space="preserve"> gaste 1 Karma para transformar Falha em Parcial. Não gera o +1 Karma.</w:t>
+        <w:t xml:space="preserve">Crítico (6+6):</w:t>
+      </w:r>
+      <w:r>
+        <w:rPr>
+          <w:rFonts w:ascii="Calibri" w:cs="Calibri" w:eastAsia="Calibri" w:hAnsi="Calibri"/>
+          <w:sz w:val="22"/>
+          <w:szCs w:val="22"/>
+        </w:rPr>
+        <w:t xml:space="preserve"> sempre Pleno + Eco + 3 Dano</w:t>
       </w:r>
     </w:p>
     <w:p>
@@ -7498,20 +7736,10 @@
       <w:r>
         <w:rPr>
           <w:rFonts w:ascii="Calibri" w:cs="Calibri" w:eastAsia="Calibri" w:hAnsi="Calibri"/>
-          <w:b/>
-          <w:bCs/>
-          <w:sz w:val="22"/>
-          <w:szCs w:val="22"/>
-        </w:rPr>
-        <w:t xml:space="preserve">Fôlego (NOVO):</w:t>
-      </w:r>
-      <w:r>
-        <w:rPr>
-          <w:rFonts w:ascii="Calibri" w:cs="Calibri" w:eastAsia="Calibri" w:hAnsi="Calibri"/>
-          <w:sz w:val="22"/>
-          <w:szCs w:val="22"/>
-        </w:rPr>
-        <w:t xml:space="preserve"> troque um Naipe por +1 Karma ao invés de usá-lo.</w:t>
+          <w:sz w:val="22"/>
+          <w:szCs w:val="22"/>
+        </w:rPr>
+        <w:t xml:space="preserve">Reduz 1 dano por gasto (era 2)</w:t>
       </w:r>
     </w:p>
     <w:p>
@@ -7526,10 +7754,20 @@
       <w:r>
         <w:rPr>
           <w:rFonts w:ascii="Calibri" w:cs="Calibri" w:eastAsia="Calibri" w:hAnsi="Calibri"/>
-          <w:sz w:val="22"/>
-          <w:szCs w:val="22"/>
-        </w:rPr>
-        <w:t xml:space="preserve">Removido: gastar Karma pra subir tier de resultado</w:t>
+          <w:b/>
+          <w:bCs/>
+          <w:sz w:val="22"/>
+          <w:szCs w:val="22"/>
+        </w:rPr>
+        <w:t xml:space="preserve">Forçar (NOVO):</w:t>
+      </w:r>
+      <w:r>
+        <w:rPr>
+          <w:rFonts w:ascii="Calibri" w:cs="Calibri" w:eastAsia="Calibri" w:hAnsi="Calibri"/>
+          <w:sz w:val="22"/>
+          <w:szCs w:val="22"/>
+        </w:rPr>
+        <w:t xml:space="preserve"> gaste 1 Karma para transformar Falha em Parcial. Não gera o +1 Karma.</w:t>
       </w:r>
     </w:p>
     <w:p>
@@ -7544,10 +7782,20 @@
       <w:r>
         <w:rPr>
           <w:rFonts w:ascii="Calibri" w:cs="Calibri" w:eastAsia="Calibri" w:hAnsi="Calibri"/>
-          <w:sz w:val="22"/>
-          <w:szCs w:val="22"/>
-        </w:rPr>
-        <w:t xml:space="preserve">Reseta pra 2 entre fases de combate</w:t>
+          <w:b/>
+          <w:bCs/>
+          <w:sz w:val="22"/>
+          <w:szCs w:val="22"/>
+        </w:rPr>
+        <w:t xml:space="preserve">Fôlego (NOVO):</w:t>
+      </w:r>
+      <w:r>
+        <w:rPr>
+          <w:rFonts w:ascii="Calibri" w:cs="Calibri" w:eastAsia="Calibri" w:hAnsi="Calibri"/>
+          <w:sz w:val="22"/>
+          <w:szCs w:val="22"/>
+        </w:rPr>
+        <w:t xml:space="preserve"> troque um Naipe por +1 Karma ao invés de usá-lo.</w:t>
       </w:r>
     </w:p>
     <w:p>
@@ -7562,37 +7810,10 @@
       <w:r>
         <w:rPr>
           <w:rFonts w:ascii="Calibri" w:cs="Calibri" w:eastAsia="Calibri" w:hAnsi="Calibri"/>
-          <w:b/>
-          <w:bCs/>
-          <w:sz w:val="22"/>
-          <w:szCs w:val="22"/>
-        </w:rPr>
-        <w:t xml:space="preserve">Regra de timing:</w:t>
-      </w:r>
-      <w:r>
-        <w:rPr>
-          <w:rFonts w:ascii="Calibri" w:cs="Calibri" w:eastAsia="Calibri" w:hAnsi="Calibri"/>
-          <w:sz w:val="22"/>
-          <w:szCs w:val="22"/>
-        </w:rPr>
-        <w:t xml:space="preserve"> Karma ganho só pode ser gasto a partir da próxima rolagem</w:t>
-      </w:r>
-    </w:p>
-    <w:p>
-      <w:pPr>
-        <w:pStyle w:val="Heading2"/>
-        <w:spacing w:after="80" w:before="280"/>
-      </w:pPr>
-      <w:r>
-        <w:rPr>
-          <w:rFonts w:ascii="Calibri" w:cs="Calibri" w:eastAsia="Calibri" w:hAnsi="Calibri"/>
-          <w:b/>
-          <w:bCs/>
-          <w:color w:val="374151"/>
-          <w:sz w:val="26"/>
-          <w:szCs w:val="26"/>
-        </w:rPr>
-        <w:t xml:space="preserve">Combinação (simplificada)</w:t>
+          <w:sz w:val="22"/>
+          <w:szCs w:val="22"/>
+        </w:rPr>
+        <w:t xml:space="preserve">Removido: gastar Karma pra subir tier de resultado</w:t>
       </w:r>
     </w:p>
     <w:p>
@@ -7610,7 +7831,7 @@
           <w:sz w:val="22"/>
           <w:szCs w:val="22"/>
         </w:rPr>
-        <w:t xml:space="preserve">Usa a melhor Base (era a pior)</w:t>
+        <w:t xml:space="preserve">Reseta pra 2 entre fases de combate</w:t>
       </w:r>
     </w:p>
     <w:p>
@@ -7625,10 +7846,37 @@
       <w:r>
         <w:rPr>
           <w:rFonts w:ascii="Calibri" w:cs="Calibri" w:eastAsia="Calibri" w:hAnsi="Calibri"/>
-          <w:sz w:val="22"/>
-          <w:szCs w:val="22"/>
-        </w:rPr>
-        <w:t xml:space="preserve">Dá +1 dano e +1 Naipe além do efeito narrativo</w:t>
+          <w:b/>
+          <w:bCs/>
+          <w:sz w:val="22"/>
+          <w:szCs w:val="22"/>
+        </w:rPr>
+        <w:t xml:space="preserve">Regra de timing:</w:t>
+      </w:r>
+      <w:r>
+        <w:rPr>
+          <w:rFonts w:ascii="Calibri" w:cs="Calibri" w:eastAsia="Calibri" w:hAnsi="Calibri"/>
+          <w:sz w:val="22"/>
+          <w:szCs w:val="22"/>
+        </w:rPr>
+        <w:t xml:space="preserve"> Karma ganho só pode ser gasto a partir da próxima rolagem</w:t>
+      </w:r>
+    </w:p>
+    <w:p>
+      <w:pPr>
+        <w:pStyle w:val="Heading2"/>
+        <w:spacing w:after="80" w:before="280"/>
+      </w:pPr>
+      <w:r>
+        <w:rPr>
+          <w:rFonts w:ascii="Calibri" w:cs="Calibri" w:eastAsia="Calibri" w:hAnsi="Calibri"/>
+          <w:b/>
+          <w:bCs/>
+          <w:color w:val="374151"/>
+          <w:sz w:val="26"/>
+          <w:szCs w:val="26"/>
+        </w:rPr>
+        <w:t xml:space="preserve">Combinação (simplificada)</w:t>
       </w:r>
     </w:p>
     <w:p>
@@ -7646,24 +7894,7 @@
           <w:sz w:val="22"/>
           <w:szCs w:val="22"/>
         </w:rPr>
-        <w:t xml:space="preserve">Removido: Vantagem (3d6 descarta maior) não existe mais</w:t>
-      </w:r>
-    </w:p>
-    <w:p>
-      <w:pPr>
-        <w:pStyle w:val="Heading2"/>
-        <w:spacing w:after="80" w:before="280"/>
-      </w:pPr>
-      <w:r>
-        <w:rPr>
-          <w:rFonts w:ascii="Calibri" w:cs="Calibri" w:eastAsia="Calibri" w:hAnsi="Calibri"/>
-          <w:b/>
-          <w:bCs/>
-          <w:color w:val="374151"/>
-          <w:sz w:val="26"/>
-          <w:szCs w:val="26"/>
-        </w:rPr>
-        <w:t xml:space="preserve">Defesa (reescrita total)</w:t>
+        <w:t xml:space="preserve">Usa a melhor Base (era a pior)</w:t>
       </w:r>
     </w:p>
     <w:p>
@@ -7681,7 +7912,60 @@
           <w:sz w:val="22"/>
           <w:szCs w:val="22"/>
         </w:rPr>
-        <w:t xml:space="preserve">Automática, não custa ação</w:t>
+        <w:t xml:space="preserve">Dá +1 dano e +1 Naipe (em Parcial e Pleno) além do efeito narrativo</w:t>
+      </w:r>
+    </w:p>
+    <w:p>
+      <w:pPr>
+        <w:pStyle w:val="ListParagraph"/>
+        <w:numPr>
+          <w:ilvl w:val="0"/>
+          <w:numId w:val="2"/>
+        </w:numPr>
+        <w:spacing w:after="60"/>
+      </w:pPr>
+      <w:r>
+        <w:rPr>
+          <w:rFonts w:ascii="Calibri" w:cs="Calibri" w:eastAsia="Calibri" w:hAnsi="Calibri"/>
+          <w:sz w:val="22"/>
+          <w:szCs w:val="22"/>
+        </w:rPr>
+        <w:t xml:space="preserve">Removido: Vantagem (3d6 descarta maior) não existe mais</w:t>
+      </w:r>
+    </w:p>
+    <w:p>
+      <w:pPr>
+        <w:pStyle w:val="Heading2"/>
+        <w:spacing w:after="80" w:before="280"/>
+      </w:pPr>
+      <w:r>
+        <w:rPr>
+          <w:rFonts w:ascii="Calibri" w:cs="Calibri" w:eastAsia="Calibri" w:hAnsi="Calibri"/>
+          <w:b/>
+          <w:bCs/>
+          <w:color w:val="374151"/>
+          <w:sz w:val="26"/>
+          <w:szCs w:val="26"/>
+        </w:rPr>
+        <w:t xml:space="preserve">Defesa (reescrita total)</w:t>
+      </w:r>
+    </w:p>
+    <w:p>
+      <w:pPr>
+        <w:pStyle w:val="ListParagraph"/>
+        <w:numPr>
+          <w:ilvl w:val="0"/>
+          <w:numId w:val="2"/>
+        </w:numPr>
+        <w:spacing w:after="60"/>
+      </w:pPr>
+      <w:r>
+        <w:rPr>
+          <w:rFonts w:ascii="Calibri" w:cs="Calibri" w:eastAsia="Calibri" w:hAnsi="Calibri"/>
+          <w:sz w:val="22"/>
+          <w:szCs w:val="22"/>
+        </w:rPr>
+        <w:t xml:space="preserve">Opcional, não custa ação</w:t>
       </w:r>
     </w:p>
     <w:p>

</xml_diff>

<commit_message>
fix(rolagem): correct Parcial range to margin 0-2 and fix example roll
- Parcial: Base a Base+2 (margin 0-2), Pleno: Base+3 ou mais (margin ≥3)
- Fix example roll from 4 to 9 (margin 4 = Pleno with Base 5)
- Update revision guide table with correct range description

Co-Authored-By: Claude Opus 4.6 <noreply@anthropic.com>
Claude-Session: https://claude.ai/code/session_01RVU8t57j5oRMTt1gU1F1Um
</commit_message>
<xml_diff>
--- a/SAGA_v06_Patch_Notes.docx
+++ b/SAGA_v06_Patch_Notes.docx
@@ -3676,7 +3676,7 @@
           <w:sz w:val="22"/>
           <w:szCs w:val="22"/>
         </w:rPr>
-        <w:t xml:space="preserve">→ Rola 2d6 vs Base 5. Resultado: 4. Pleno! 2 Dano.</w:t>
+        <w:t xml:space="preserve">→ Rola 2d6 vs Base 5. Resultado: 9 (margem 4). Pleno! 2 Dano.</w:t>
       </w:r>
     </w:p>
     <w:p>
@@ -5487,7 +5487,7 @@
                 <w:sz w:val="20"/>
                 <w:szCs w:val="20"/>
               </w:rPr>
-              <w:t xml:space="preserve">Corrigir Bases 5/6/7 para 4/5/6. Parcial agora é Base+1 a +3.</w:t>
+              <w:t xml:space="preserve">Corrigir Bases 5/6/7 para 4/5/6. Parcial agora é Base a Base+2 (margem 0-2). Pleno é Base+3 ou mais.</w:t>
             </w:r>
           </w:p>
         </w:tc>

</xml_diff>

<commit_message>
feat(naipes): add Exemplo 4 — Assinatura + Elemento Ambiental
New example showing Investida de Touro (Assinatura: Empurrar) activating
on Parcial, pushing enemy into fire for +1 Dano from environmental element.
Demonstrates Assinaturas triggering on Parcial and Empurrar + Elemento combo.

Co-Authored-By: Claude Opus 4.6 <noreply@anthropic.com>
Claude-Session: https://claude.ai/code/session_01RVU8t57j5oRMTt1gU1F1Um
</commit_message>
<xml_diff>
--- a/SAGA_v06_Patch_Notes.docx
+++ b/SAGA_v06_Patch_Notes.docx
@@ -3827,6 +3827,195 @@
           <w:szCs w:val="22"/>
         </w:rPr>
         <w:t xml:space="preserve">→ Marca na ficha. Próximo Parcial (qualquer rolagem) vira Pleno. Se rolar Pleno ou Falha, Ressonância fica guardada.</w:t>
+      </w:r>
+    </w:p>
+    <w:p>
+      <w:pPr>
+        <w:spacing w:after="120"/>
+      </w:pPr>
+      <w:r>
+        <w:rPr>
+          <w:rFonts w:ascii="Calibri" w:cs="Calibri" w:eastAsia="Calibri" w:hAnsi="Calibri"/>
+          <w:b/>
+          <w:bCs/>
+          <w:sz w:val="22"/>
+          <w:szCs w:val="22"/>
+        </w:rPr>
+        <w:t xml:space="preserve">Exemplo 4 — Assinatura + Elemento Ambiental</w:t>
+      </w:r>
+    </w:p>
+    <w:p>
+      <w:pPr>
+        <w:spacing w:after="120"/>
+      </w:pPr>
+      <w:r>
+        <w:rPr>
+          <w:rFonts w:ascii="Calibri" w:cs="Calibri" w:eastAsia="Calibri" w:hAnsi="Calibri"/>
+          <w:b/>
+          <w:bCs/>
+          <w:sz w:val="22"/>
+          <w:szCs w:val="22"/>
+        </w:rPr>
+        <w:t xml:space="preserve">Mestre:</w:t>
+      </w:r>
+      <w:r>
+        <w:rPr>
+          <w:rFonts w:ascii="Calibri" w:cs="Calibri" w:eastAsia="Calibri" w:hAnsi="Calibri"/>
+          <w:sz w:val="22"/>
+          <w:szCs w:val="22"/>
+        </w:rPr>
+        <w:t xml:space="preserve"> "O salão do trono está pegando fogo. Chamas nas laterais, caminho livre só no centro. O guarda avança."</w:t>
+      </w:r>
+    </w:p>
+    <w:p>
+      <w:pPr>
+        <w:spacing w:after="120"/>
+      </w:pPr>
+      <w:r>
+        <w:rPr>
+          <w:rFonts w:ascii="Calibri" w:cs="Calibri" w:eastAsia="Calibri" w:hAnsi="Calibri"/>
+          <w:b/>
+          <w:bCs/>
+          <w:sz w:val="22"/>
+          <w:szCs w:val="22"/>
+        </w:rPr>
+        <w:t xml:space="preserve">Jogador:</w:t>
+      </w:r>
+      <w:r>
+        <w:rPr>
+          <w:rFonts w:ascii="Calibri" w:cs="Calibri" w:eastAsia="Calibri" w:hAnsi="Calibri"/>
+          <w:sz w:val="22"/>
+          <w:szCs w:val="22"/>
+        </w:rPr>
+        <w:t xml:space="preserve"> "Uso </w:t>
+      </w:r>
+      <w:r>
+        <w:rPr>
+          <w:rFonts w:ascii="Calibri" w:cs="Calibri" w:eastAsia="Calibri" w:hAnsi="Calibri"/>
+          <w:i/>
+          <w:iCs/>
+          <w:sz w:val="22"/>
+          <w:szCs w:val="22"/>
+        </w:rPr>
+        <w:t xml:space="preserve">Investida de Touro</w:t>
+      </w:r>
+      <w:r>
+        <w:rPr>
+          <w:rFonts w:ascii="Calibri" w:cs="Calibri" w:eastAsia="Calibri" w:hAnsi="Calibri"/>
+          <w:sz w:val="22"/>
+          <w:szCs w:val="22"/>
+        </w:rPr>
+        <w:t xml:space="preserve">!" </w:t>
+      </w:r>
+      <w:r>
+        <w:rPr>
+          <w:rFonts w:ascii="Calibri" w:cs="Calibri" w:eastAsia="Calibri" w:hAnsi="Calibri"/>
+          <w:i/>
+          <w:iCs/>
+          <w:sz w:val="22"/>
+          <w:szCs w:val="22"/>
+        </w:rPr>
+        <w:t xml:space="preserve">(Escudeiro, Base 4 — Assinatura: Empurrar)</w:t>
+      </w:r>
+    </w:p>
+    <w:p>
+      <w:pPr>
+        <w:spacing w:after="120"/>
+      </w:pPr>
+      <w:r>
+        <w:rPr>
+          <w:rFonts w:ascii="Calibri" w:cs="Calibri" w:eastAsia="Calibri" w:hAnsi="Calibri"/>
+          <w:sz w:val="22"/>
+          <w:szCs w:val="22"/>
+        </w:rPr>
+        <w:t xml:space="preserve">→ Rola 2d6 → </w:t>
+      </w:r>
+      <w:r>
+        <w:rPr>
+          <w:rFonts w:ascii="Calibri" w:cs="Calibri" w:eastAsia="Calibri" w:hAnsi="Calibri"/>
+          <w:b/>
+          <w:bCs/>
+          <w:sz w:val="22"/>
+          <w:szCs w:val="22"/>
+        </w:rPr>
+        <w:t xml:space="preserve">5</w:t>
+      </w:r>
+      <w:r>
+        <w:rPr>
+          <w:rFonts w:ascii="Calibri" w:cs="Calibri" w:eastAsia="Calibri" w:hAnsi="Calibri"/>
+          <w:sz w:val="22"/>
+          <w:szCs w:val="22"/>
+        </w:rPr>
+        <w:t xml:space="preserve">. Margem 1. Parcial! 1 Dano e +1 Karma.</w:t>
+      </w:r>
+    </w:p>
+    <w:p>
+      <w:pPr>
+        <w:spacing w:after="120"/>
+      </w:pPr>
+      <w:r>
+        <w:rPr>
+          <w:rFonts w:ascii="Calibri" w:cs="Calibri" w:eastAsia="Calibri" w:hAnsi="Calibri"/>
+          <w:b/>
+          <w:bCs/>
+          <w:sz w:val="22"/>
+          <w:szCs w:val="22"/>
+        </w:rPr>
+        <w:t xml:space="preserve">Mestre:</w:t>
+      </w:r>
+      <w:r>
+        <w:rPr>
+          <w:rFonts w:ascii="Calibri" w:cs="Calibri" w:eastAsia="Calibri" w:hAnsi="Calibri"/>
+          <w:sz w:val="22"/>
+          <w:szCs w:val="22"/>
+        </w:rPr>
+        <w:t xml:space="preserve"> "Investida de Touro é sua Assinatura — Empurrar ativa mesmo no Parcial. Pra onde você joga ele?"</w:t>
+      </w:r>
+    </w:p>
+    <w:p>
+      <w:pPr>
+        <w:spacing w:after="120"/>
+      </w:pPr>
+      <w:r>
+        <w:rPr>
+          <w:rFonts w:ascii="Calibri" w:cs="Calibri" w:eastAsia="Calibri" w:hAnsi="Calibri"/>
+          <w:b/>
+          <w:bCs/>
+          <w:sz w:val="22"/>
+          <w:szCs w:val="22"/>
+        </w:rPr>
+        <w:t xml:space="preserve">Jogador:</w:t>
+      </w:r>
+      <w:r>
+        <w:rPr>
+          <w:rFonts w:ascii="Calibri" w:cs="Calibri" w:eastAsia="Calibri" w:hAnsi="Calibri"/>
+          <w:sz w:val="22"/>
+          <w:szCs w:val="22"/>
+        </w:rPr>
+        <w:t xml:space="preserve"> "Contra as chamas."</w:t>
+      </w:r>
+    </w:p>
+    <w:p>
+      <w:pPr>
+        <w:spacing w:after="120"/>
+      </w:pPr>
+      <w:r>
+        <w:rPr>
+          <w:rFonts w:ascii="Calibri" w:cs="Calibri" w:eastAsia="Calibri" w:hAnsi="Calibri"/>
+          <w:b/>
+          <w:bCs/>
+          <w:sz w:val="22"/>
+          <w:szCs w:val="22"/>
+        </w:rPr>
+        <w:t xml:space="preserve">Mestre:</w:t>
+      </w:r>
+      <w:r>
+        <w:rPr>
+          <w:rFonts w:ascii="Calibri" w:cs="Calibri" w:eastAsia="Calibri" w:hAnsi="Calibri"/>
+          <w:sz w:val="22"/>
+          <w:szCs w:val="22"/>
+        </w:rPr>
+        <w:t xml:space="preserve"> "O guarda tropeça pro fogo — 1 Dano do ataque + 1 Dano do Elemento Ambiental. 2 Dano total. E você ganha +1 Karma pelo Parcial."</w:t>
       </w:r>
     </w:p>
     <w:p>

</xml_diff>